<commit_message>
Changed the name QuickBite with QABite because QuickBite is a registered TM!
</commit_message>
<xml_diff>
--- a/EG 01-Requirements and Design.docx
+++ b/EG 01-Requirements and Design.docx
@@ -891,53 +891,67 @@
           <w:b/>
           <w:bCs/>
         </w:rPr>
-        <w:t>QuickBite</w:t>
+        <w:t>QABite</w:t>
       </w:r>
       <w:proofErr w:type="spellEnd"/>
-      <w:r>
-        <w:t xml:space="preserve"> </w:t>
-      </w:r>
-      <w:r>
-        <w:t xml:space="preserve">(Or choose another name) </w:t>
-      </w:r>
-      <w:r>
-        <w:t>is planning to launch a new food delivery platform to compete with services like Uber Eats and Deliveroo.</w:t>
-      </w:r>
-    </w:p>
-    <w:p>
-      <w:r>
-        <w:t>The goal is to create a system that connects customers, restaurants, and delivery drivers through a single platform that manages ordering, preparation, and delivery of food.</w:t>
-      </w:r>
-    </w:p>
-    <w:p>
-      <w:r>
-        <w:t>The founders have come to your development team with a rough idea of how the system should work, but no formal specification exists yet.</w:t>
-      </w:r>
-    </w:p>
-    <w:p>
-      <w:r>
-        <w:t>Your task is to analyse the scenario and design the system from scratch.</w:t>
-      </w:r>
-    </w:p>
-    <w:p/>
-    <w:p>
-      <w:pPr>
-        <w:pStyle w:val="Heading3"/>
-      </w:pPr>
-      <w:r>
-        <w:t>Scenario Description</w:t>
-      </w:r>
-    </w:p>
-    <w:p>
-      <w:proofErr w:type="spellStart"/>
       <w:r>
         <w:rPr>
           <w:b/>
           <w:bCs/>
         </w:rPr>
-        <w:t>QuickBite</w:t>
+        <w:t xml:space="preserve"> </w:t>
+      </w:r>
+      <w:r>
+        <w:t xml:space="preserve"> </w:t>
+      </w:r>
+      <w:r>
+        <w:t xml:space="preserve">(Or choose another name) </w:t>
+      </w:r>
+      <w:r>
+        <w:t>is planning to launch a new food delivery platform to compete with services like Uber Eats and Deliveroo.</w:t>
+      </w:r>
+    </w:p>
+    <w:p>
+      <w:r>
+        <w:t>The goal is to create a system that connects customers, restaurants, and delivery drivers through a single platform that manages ordering, preparation, and delivery of food.</w:t>
+      </w:r>
+    </w:p>
+    <w:p>
+      <w:r>
+        <w:t>The founders have come to your development team with a rough idea of how the system should work, but no formal specification exists yet.</w:t>
+      </w:r>
+    </w:p>
+    <w:p>
+      <w:r>
+        <w:t>Your task is to analyse the scenario and design the system from scratch.</w:t>
+      </w:r>
+    </w:p>
+    <w:p/>
+    <w:p>
+      <w:pPr>
+        <w:pStyle w:val="Heading3"/>
+      </w:pPr>
+      <w:r>
+        <w:t>Scenario Description</w:t>
+      </w:r>
+    </w:p>
+    <w:p>
+      <w:proofErr w:type="spellStart"/>
+      <w:r>
+        <w:rPr>
+          <w:b/>
+          <w:bCs/>
+        </w:rPr>
+        <w:t>QABite</w:t>
       </w:r>
       <w:proofErr w:type="spellEnd"/>
+      <w:r>
+        <w:rPr>
+          <w:b/>
+          <w:bCs/>
+        </w:rPr>
+        <w:t xml:space="preserve"> </w:t>
+      </w:r>
       <w:r>
         <w:t xml:space="preserve"> allows customers to browse nearby restaurants, view menus, and place orders for delivery.</w:t>
       </w:r>

</xml_diff>